<commit_message>
Added On the Wall assignment
</commit_message>
<xml_diff>
--- a/module-1/Garcia-Assignment1_2.-325docx.docx
+++ b/module-1/Garcia-Assignment1_2.-325docx.docx
@@ -38,15 +38,7 @@
     </w:p>
     <w:p>
       <w:r>
-        <w:t xml:space="preserve">----                 ------------- </w:t>
-      </w:r>
-      <w:proofErr w:type="gramStart"/>
-      <w:r>
-        <w:t xml:space="preserve">        </w:t>
-      </w:r>
-      <w:proofErr w:type="gramEnd"/>
-      <w:r>
-        <w:t>------ ----</w:t>
+        <w:t>----                 -------------         ------ ----</w:t>
       </w:r>
     </w:p>
     <w:p>
@@ -77,15 +69,7 @@
     </w:p>
     <w:p>
       <w:r>
-        <w:t xml:space="preserve">----                 ------------- </w:t>
-      </w:r>
-      <w:proofErr w:type="gramStart"/>
-      <w:r>
-        <w:t xml:space="preserve">        </w:t>
-      </w:r>
-      <w:proofErr w:type="gramEnd"/>
-      <w:r>
-        <w:t>------ ----</w:t>
+        <w:t>----                 -------------         ------ ----</w:t>
       </w:r>
     </w:p>
     <w:p>
@@ -95,13 +79,8 @@
     </w:p>
     <w:p>
       <w:r>
-        <w:t xml:space="preserve">-a----          6/6/2026   9:20 PM           </w:t>
-      </w:r>
-      <w:proofErr w:type="gramStart"/>
-      <w:r>
-        <w:t>4846 .gitignore</w:t>
-      </w:r>
-      <w:proofErr w:type="gramEnd"/>
+        <w:t>-a----          6/6/2026   9:20 PM           4846 .gitignore</w:t>
+      </w:r>
     </w:p>
     <w:p>
       <w:r>
@@ -243,6 +222,9 @@
     </w:p>
     <w:p>
       <w:r>
+        <w:rPr>
+          <w:noProof/>
+        </w:rPr>
         <w:drawing>
           <wp:inline distT="0" distB="0" distL="0" distR="0" wp14:anchorId="45E40881" wp14:editId="3FF8E133">
             <wp:extent cx="5943600" cy="2948940"/>
@@ -268,6 +250,46 @@
                     <a:xfrm>
                       <a:off x="0" y="0"/>
                       <a:ext cx="5943600" cy="2948940"/>
+                    </a:xfrm>
+                    <a:prstGeom prst="rect">
+                      <a:avLst/>
+                    </a:prstGeom>
+                  </pic:spPr>
+                </pic:pic>
+              </a:graphicData>
+            </a:graphic>
+          </wp:inline>
+        </w:drawing>
+      </w:r>
+    </w:p>
+    <w:p>
+      <w:r>
+        <w:lastRenderedPageBreak/>
+        <w:drawing>
+          <wp:inline distT="0" distB="0" distL="0" distR="0" wp14:anchorId="2578AACC" wp14:editId="7696212D">
+            <wp:extent cx="5943600" cy="2674620"/>
+            <wp:effectExtent l="0" t="0" r="0" b="0"/>
+            <wp:docPr id="1122394725" name="Picture 1"/>
+            <wp:cNvGraphicFramePr>
+              <a:graphicFrameLocks xmlns:a="http://schemas.openxmlformats.org/drawingml/2006/main" noChangeAspect="1"/>
+            </wp:cNvGraphicFramePr>
+            <a:graphic xmlns:a="http://schemas.openxmlformats.org/drawingml/2006/main">
+              <a:graphicData uri="http://schemas.openxmlformats.org/drawingml/2006/picture">
+                <pic:pic xmlns:pic="http://schemas.openxmlformats.org/drawingml/2006/picture">
+                  <pic:nvPicPr>
+                    <pic:cNvPr id="1122394725" name=""/>
+                    <pic:cNvPicPr/>
+                  </pic:nvPicPr>
+                  <pic:blipFill>
+                    <a:blip r:embed="rId6"/>
+                    <a:stretch>
+                      <a:fillRect/>
+                    </a:stretch>
+                  </pic:blipFill>
+                  <pic:spPr>
+                    <a:xfrm>
+                      <a:off x="0" y="0"/>
+                      <a:ext cx="5943600" cy="2674620"/>
                     </a:xfrm>
                     <a:prstGeom prst="rect">
                       <a:avLst/>

</xml_diff>